<commit_message>
Finalize lab 2 report and startup script
</commit_message>
<xml_diff>
--- a/lab2_report/Abramiak_2.docx
+++ b/lab2_report/Abramiak_2.docx
@@ -4395,8 +4395,9 @@
     </w:p>
     <w:p>
       <w:pPr>
+        <w:pStyle w:val="a9"/>
         <w:spacing w:line="360" w:lineRule="auto"/>
-        <w:ind w:left="720" w:right="567"/>
+        <w:ind w:right="567"/>
         <w:jc w:val="both"/>
         <w:rPr>
           <w:color w:val="000000" w:themeColor="text1"/>
@@ -4406,21 +4407,25 @@
       </w:pPr>
       <w:r>
         <w:rPr>
-          <w:noProof/>
+          <w:b/>
+          <w:bCs/>
+          <w:color w:val="000000" w:themeColor="text1"/>
+          <w:sz w:val="28"/>
+          <w:szCs w:val="28"/>
         </w:rPr>
         <w:drawing>
-          <wp:anchor distT="0" distB="0" distL="114300" distR="114300" simplePos="0" relativeHeight="251670528" behindDoc="0" locked="0" layoutInCell="1" allowOverlap="1" wp14:anchorId="03873672" wp14:editId="6CA648B1">
+          <wp:anchor distT="0" distB="0" distL="114300" distR="114300" simplePos="0" relativeHeight="251730944" behindDoc="0" locked="0" layoutInCell="1" allowOverlap="1" wp14:anchorId="282AD1CA" wp14:editId="7AB7AA6C">
             <wp:simplePos x="0" y="0"/>
-            <wp:positionH relativeFrom="column">
-              <wp:posOffset>330200</wp:posOffset>
+            <wp:positionH relativeFrom="margin">
+              <wp:posOffset>306705</wp:posOffset>
             </wp:positionH>
             <wp:positionV relativeFrom="paragraph">
-              <wp:posOffset>3285490</wp:posOffset>
+              <wp:posOffset>3224530</wp:posOffset>
             </wp:positionV>
-            <wp:extent cx="4311015" cy="2804160"/>
-            <wp:effectExtent l="0" t="0" r="0" b="0"/>
+            <wp:extent cx="4258310" cy="3314700"/>
+            <wp:effectExtent l="0" t="0" r="8890" b="0"/>
             <wp:wrapTopAndBottom/>
-            <wp:docPr id="1266333602" name="Рисунок 1"/>
+            <wp:docPr id="1402480628" name="Рисунок 1"/>
             <wp:cNvGraphicFramePr>
               <a:graphicFrameLocks xmlns:a="http://schemas.openxmlformats.org/drawingml/2006/main" noChangeAspect="1"/>
             </wp:cNvGraphicFramePr>
@@ -4428,7 +4433,7 @@
               <a:graphicData uri="http://schemas.openxmlformats.org/drawingml/2006/picture">
                 <pic:pic xmlns:pic="http://schemas.openxmlformats.org/drawingml/2006/picture">
                   <pic:nvPicPr>
-                    <pic:cNvPr id="1266333602" name=""/>
+                    <pic:cNvPr id="1402480628" name=""/>
                     <pic:cNvPicPr/>
                   </pic:nvPicPr>
                   <pic:blipFill>
@@ -4440,7 +4445,7 @@
                   <pic:spPr>
                     <a:xfrm>
                       <a:off x="0" y="0"/>
-                      <a:ext cx="4311015" cy="2804160"/>
+                      <a:ext cx="4258310" cy="3314700"/>
                     </a:xfrm>
                     <a:prstGeom prst="rect">
                       <a:avLst/>
@@ -4461,13 +4466,10 @@
       <w:r>
         <w:rPr>
           <w:noProof/>
-          <w:color w:val="000000" w:themeColor="text1"/>
-          <w:sz w:val="28"/>
-          <w:szCs w:val="28"/>
           <w14:ligatures w14:val="standardContextual"/>
         </w:rPr>
         <w:drawing>
-          <wp:anchor distT="0" distB="0" distL="114300" distR="114300" simplePos="0" relativeHeight="251668480" behindDoc="0" locked="0" layoutInCell="1" allowOverlap="1" wp14:anchorId="00EF7B14" wp14:editId="529BFFA6">
+          <wp:anchor distT="0" distB="0" distL="114300" distR="114300" simplePos="0" relativeHeight="251668480" behindDoc="0" locked="0" layoutInCell="1" allowOverlap="1" wp14:anchorId="00EF7B14" wp14:editId="1F11221D">
             <wp:simplePos x="0" y="0"/>
             <wp:positionH relativeFrom="margin">
               <wp:posOffset>292100</wp:posOffset>
@@ -4535,335 +4537,362 @@
     </w:p>
     <w:p>
       <w:pPr>
-        <w:pStyle w:val="a9"/>
-        <w:spacing w:line="360" w:lineRule="auto"/>
-        <w:ind w:right="567"/>
-        <w:rPr>
-          <w:color w:val="000000" w:themeColor="text1"/>
-          <w:sz w:val="26"/>
-          <w:szCs w:val="26"/>
-        </w:rPr>
-      </w:pPr>
-      <w:r>
-        <w:t xml:space="preserve"> </w:t>
-      </w:r>
-      <w:r>
-        <w:rPr>
-          <w:color w:val="000000" w:themeColor="text1"/>
-          <w:sz w:val="26"/>
-          <w:szCs w:val="26"/>
-        </w:rPr>
+        <w:pStyle w:val="af0"/>
+        <w:spacing w:line="288" w:lineRule="auto"/>
+        <w:ind w:left="720"/>
+        <w:rPr>
+          <w:sz w:val="28"/>
+          <w:szCs w:val="28"/>
+        </w:rPr>
+      </w:pPr>
+      <w:r>
+        <w:rPr>
+          <w:sz w:val="28"/>
+          <w:szCs w:val="28"/>
+        </w:rPr>
+        <w:lastRenderedPageBreak/>
         <w:t xml:space="preserve">Для автоматизації запуску </w:t>
       </w:r>
       <w:proofErr w:type="spellStart"/>
       <w:r>
         <w:rPr>
-          <w:color w:val="000000" w:themeColor="text1"/>
-          <w:sz w:val="26"/>
-          <w:szCs w:val="26"/>
+          <w:sz w:val="28"/>
+          <w:szCs w:val="28"/>
         </w:rPr>
         <w:t>симуляційного</w:t>
       </w:r>
       <w:proofErr w:type="spellEnd"/>
       <w:r>
         <w:rPr>
-          <w:color w:val="000000" w:themeColor="text1"/>
-          <w:sz w:val="26"/>
-          <w:szCs w:val="26"/>
+          <w:sz w:val="28"/>
+          <w:szCs w:val="28"/>
         </w:rPr>
         <w:t xml:space="preserve"> середовища в ОС </w:t>
       </w:r>
       <w:proofErr w:type="spellStart"/>
       <w:r>
         <w:rPr>
-          <w:color w:val="000000" w:themeColor="text1"/>
-          <w:sz w:val="26"/>
-          <w:szCs w:val="26"/>
+          <w:sz w:val="28"/>
+          <w:szCs w:val="28"/>
         </w:rPr>
         <w:t>Ubuntu</w:t>
       </w:r>
       <w:proofErr w:type="spellEnd"/>
       <w:r>
         <w:rPr>
-          <w:color w:val="000000" w:themeColor="text1"/>
-          <w:sz w:val="26"/>
-          <w:szCs w:val="26"/>
+          <w:sz w:val="28"/>
+          <w:szCs w:val="28"/>
         </w:rPr>
         <w:t xml:space="preserve"> 22.04.5 LTS (x86_64) розроблено </w:t>
       </w:r>
       <w:proofErr w:type="spellStart"/>
       <w:r>
         <w:rPr>
-          <w:color w:val="000000" w:themeColor="text1"/>
-          <w:sz w:val="26"/>
-          <w:szCs w:val="26"/>
+          <w:sz w:val="28"/>
+          <w:szCs w:val="28"/>
         </w:rPr>
         <w:t>Bash</w:t>
       </w:r>
       <w:proofErr w:type="spellEnd"/>
       <w:r>
         <w:rPr>
-          <w:color w:val="000000" w:themeColor="text1"/>
-          <w:sz w:val="26"/>
-          <w:szCs w:val="26"/>
-        </w:rPr>
-        <w:t xml:space="preserve">-скрипт start_sim.sh. Компоненти системи попередньо встановлено за </w:t>
-      </w:r>
-      <w:r>
-        <w:rPr>
-          <w:color w:val="000000" w:themeColor="text1"/>
-          <w:sz w:val="26"/>
-          <w:szCs w:val="26"/>
-        </w:rPr>
-        <w:lastRenderedPageBreak/>
-        <w:t xml:space="preserve">допомогою </w:t>
-      </w:r>
-      <w:proofErr w:type="spellStart"/>
-      <w:r>
-        <w:rPr>
-          <w:color w:val="000000" w:themeColor="text1"/>
-          <w:sz w:val="26"/>
-          <w:szCs w:val="26"/>
+          <w:sz w:val="28"/>
+          <w:szCs w:val="28"/>
+        </w:rPr>
+        <w:t xml:space="preserve">-скрипт </w:t>
+      </w:r>
+      <w:r>
+        <w:rPr>
+          <w:rStyle w:val="HTML"/>
+          <w:rFonts w:ascii="Times New Roman" w:hAnsi="Times New Roman" w:cs="Times New Roman"/>
+          <w:sz w:val="28"/>
+          <w:szCs w:val="28"/>
+        </w:rPr>
+        <w:t>start_sim.sh</w:t>
+      </w:r>
+      <w:r>
+        <w:rPr>
+          <w:sz w:val="28"/>
+          <w:szCs w:val="28"/>
+        </w:rPr>
+        <w:t xml:space="preserve">. Компоненти системи попередньо встановлено за допомогою </w:t>
+      </w:r>
+      <w:proofErr w:type="spellStart"/>
+      <w:r>
+        <w:rPr>
+          <w:rStyle w:val="HTML"/>
+          <w:rFonts w:ascii="Times New Roman" w:hAnsi="Times New Roman" w:cs="Times New Roman"/>
+          <w:sz w:val="28"/>
+          <w:szCs w:val="28"/>
         </w:rPr>
         <w:t>apt</w:t>
       </w:r>
       <w:proofErr w:type="spellEnd"/>
       <w:r>
         <w:rPr>
-          <w:color w:val="000000" w:themeColor="text1"/>
-          <w:sz w:val="26"/>
-          <w:szCs w:val="26"/>
+          <w:sz w:val="28"/>
+          <w:szCs w:val="28"/>
         </w:rPr>
         <w:t xml:space="preserve"> та </w:t>
       </w:r>
       <w:proofErr w:type="spellStart"/>
       <w:r>
         <w:rPr>
-          <w:color w:val="000000" w:themeColor="text1"/>
-          <w:sz w:val="26"/>
-          <w:szCs w:val="26"/>
+          <w:rStyle w:val="HTML"/>
+          <w:rFonts w:ascii="Times New Roman" w:hAnsi="Times New Roman" w:cs="Times New Roman"/>
+          <w:sz w:val="28"/>
+          <w:szCs w:val="28"/>
         </w:rPr>
         <w:t>git</w:t>
       </w:r>
       <w:proofErr w:type="spellEnd"/>
       <w:r>
         <w:rPr>
-          <w:color w:val="000000" w:themeColor="text1"/>
-          <w:sz w:val="26"/>
-          <w:szCs w:val="26"/>
+          <w:sz w:val="28"/>
+          <w:szCs w:val="28"/>
         </w:rPr>
         <w:t xml:space="preserve">. Призначення </w:t>
       </w:r>
       <w:proofErr w:type="spellStart"/>
       <w:r>
         <w:rPr>
-          <w:color w:val="000000" w:themeColor="text1"/>
-          <w:sz w:val="26"/>
-          <w:szCs w:val="26"/>
+          <w:sz w:val="28"/>
+          <w:szCs w:val="28"/>
         </w:rPr>
         <w:t>скрипта</w:t>
       </w:r>
       <w:proofErr w:type="spellEnd"/>
       <w:r>
         <w:rPr>
-          <w:color w:val="000000" w:themeColor="text1"/>
-          <w:sz w:val="26"/>
-          <w:szCs w:val="26"/>
-        </w:rPr>
-        <w:t xml:space="preserve"> — автоматизація ініціалізації та безпечного завершення роботи процесів без ручного введення команд. Порядок запуску є послідовним: експорт шляхів до 3D-моделей, фоновий запуск </w:t>
-      </w:r>
-      <w:proofErr w:type="spellStart"/>
-      <w:r>
-        <w:rPr>
-          <w:color w:val="000000" w:themeColor="text1"/>
-          <w:sz w:val="26"/>
-          <w:szCs w:val="26"/>
+          <w:sz w:val="28"/>
+          <w:szCs w:val="28"/>
+        </w:rPr>
+        <w:t xml:space="preserve"> — автоматизація ініціалізації та безпечного завершення роботи процесів без повторного ручного введення команд. Порядок запуску є послідовним: спочатку підключається стандартне середовище </w:t>
+      </w:r>
+      <w:proofErr w:type="spellStart"/>
+      <w:r>
+        <w:rPr>
+          <w:sz w:val="28"/>
+          <w:szCs w:val="28"/>
         </w:rPr>
         <w:t>Gazebo</w:t>
       </w:r>
       <w:proofErr w:type="spellEnd"/>
       <w:r>
         <w:rPr>
-          <w:color w:val="000000" w:themeColor="text1"/>
-          <w:sz w:val="26"/>
-          <w:szCs w:val="26"/>
-        </w:rPr>
-        <w:t xml:space="preserve"> (оператор &amp;), пауза 5 секунд та запуск </w:t>
-      </w:r>
-      <w:proofErr w:type="spellStart"/>
-      <w:r>
-        <w:rPr>
-          <w:color w:val="000000" w:themeColor="text1"/>
-          <w:sz w:val="26"/>
-          <w:szCs w:val="26"/>
+          <w:sz w:val="28"/>
+          <w:szCs w:val="28"/>
+        </w:rPr>
+        <w:t xml:space="preserve">, після чого до системних шляхів додаються каталоги 3D-моделей і плагінів </w:t>
+      </w:r>
+      <w:proofErr w:type="spellStart"/>
+      <w:r>
+        <w:rPr>
+          <w:rStyle w:val="HTML"/>
+          <w:rFonts w:ascii="Times New Roman" w:hAnsi="Times New Roman" w:cs="Times New Roman"/>
+          <w:sz w:val="28"/>
+          <w:szCs w:val="28"/>
+        </w:rPr>
+        <w:t>ardupilot_gazebo</w:t>
+      </w:r>
+      <w:proofErr w:type="spellEnd"/>
+      <w:r>
+        <w:rPr>
+          <w:sz w:val="28"/>
+          <w:szCs w:val="28"/>
+        </w:rPr>
+        <w:t xml:space="preserve">, далі </w:t>
+      </w:r>
+      <w:proofErr w:type="spellStart"/>
+      <w:r>
+        <w:rPr>
+          <w:sz w:val="28"/>
+          <w:szCs w:val="28"/>
+        </w:rPr>
+        <w:t>Gazebo</w:t>
+      </w:r>
+      <w:proofErr w:type="spellEnd"/>
+      <w:r>
+        <w:rPr>
+          <w:sz w:val="28"/>
+          <w:szCs w:val="28"/>
+        </w:rPr>
+        <w:t xml:space="preserve"> запускається у фоновому режимі за допомогою оператора </w:t>
+      </w:r>
+      <w:r>
+        <w:rPr>
+          <w:rStyle w:val="HTML"/>
+          <w:rFonts w:ascii="Times New Roman" w:hAnsi="Times New Roman" w:cs="Times New Roman"/>
+          <w:sz w:val="28"/>
+          <w:szCs w:val="28"/>
+        </w:rPr>
+        <w:t>&amp;</w:t>
+      </w:r>
+      <w:r>
+        <w:rPr>
+          <w:sz w:val="28"/>
+          <w:szCs w:val="28"/>
+        </w:rPr>
+        <w:t xml:space="preserve">, виконується пауза 5 секунд, після чого запускається </w:t>
+      </w:r>
+      <w:proofErr w:type="spellStart"/>
+      <w:r>
+        <w:rPr>
+          <w:sz w:val="28"/>
+          <w:szCs w:val="28"/>
         </w:rPr>
         <w:t>ArduPilot</w:t>
       </w:r>
       <w:proofErr w:type="spellEnd"/>
       <w:r>
         <w:rPr>
-          <w:color w:val="000000" w:themeColor="text1"/>
-          <w:sz w:val="26"/>
-          <w:szCs w:val="26"/>
-        </w:rPr>
-        <w:t xml:space="preserve"> SITL на передньому плані. Запуск середовища виконується командою ./start_sim.sh, зупинка — комбінацією </w:t>
-      </w:r>
-      <w:proofErr w:type="spellStart"/>
-      <w:r>
-        <w:rPr>
-          <w:color w:val="000000" w:themeColor="text1"/>
-          <w:sz w:val="26"/>
-          <w:szCs w:val="26"/>
+          <w:sz w:val="28"/>
+          <w:szCs w:val="28"/>
+        </w:rPr>
+        <w:t xml:space="preserve"> SITL на передньому плані. Запуск середовища виконується командою </w:t>
+      </w:r>
+      <w:r>
+        <w:rPr>
+          <w:rStyle w:val="HTML"/>
+          <w:rFonts w:ascii="Times New Roman" w:hAnsi="Times New Roman" w:cs="Times New Roman"/>
+          <w:sz w:val="28"/>
+          <w:szCs w:val="28"/>
+        </w:rPr>
+        <w:t>./start_sim.sh</w:t>
+      </w:r>
+      <w:r>
+        <w:rPr>
+          <w:sz w:val="28"/>
+          <w:szCs w:val="28"/>
+        </w:rPr>
+        <w:t xml:space="preserve">, а зупинка — комбінацією </w:t>
+      </w:r>
+      <w:proofErr w:type="spellStart"/>
+      <w:r>
+        <w:rPr>
+          <w:rStyle w:val="HTML"/>
+          <w:rFonts w:ascii="Times New Roman" w:hAnsi="Times New Roman" w:cs="Times New Roman"/>
+          <w:sz w:val="28"/>
+          <w:szCs w:val="28"/>
         </w:rPr>
         <w:t>Ctrl+C</w:t>
       </w:r>
       <w:proofErr w:type="spellEnd"/>
       <w:r>
         <w:rPr>
-          <w:color w:val="000000" w:themeColor="text1"/>
-          <w:sz w:val="26"/>
-          <w:szCs w:val="26"/>
-        </w:rPr>
-        <w:t xml:space="preserve">. Особливість даного способу — фонова робота </w:t>
-      </w:r>
-      <w:proofErr w:type="spellStart"/>
-      <w:r>
-        <w:rPr>
-          <w:color w:val="000000" w:themeColor="text1"/>
-          <w:sz w:val="26"/>
-          <w:szCs w:val="26"/>
+          <w:sz w:val="28"/>
+          <w:szCs w:val="28"/>
+        </w:rPr>
+        <w:t xml:space="preserve">. Для коректного завершення роботи застосовано команду </w:t>
+      </w:r>
+      <w:proofErr w:type="spellStart"/>
+      <w:r>
+        <w:rPr>
+          <w:rStyle w:val="HTML"/>
+          <w:rFonts w:ascii="Times New Roman" w:hAnsi="Times New Roman" w:cs="Times New Roman"/>
+          <w:sz w:val="28"/>
+          <w:szCs w:val="28"/>
+        </w:rPr>
+        <w:t>trap</w:t>
+      </w:r>
+      <w:proofErr w:type="spellEnd"/>
+      <w:r>
+        <w:rPr>
+          <w:sz w:val="28"/>
+          <w:szCs w:val="28"/>
+        </w:rPr>
+        <w:t xml:space="preserve">, яка перехоплює сигнал </w:t>
+      </w:r>
+      <w:r>
+        <w:rPr>
+          <w:rStyle w:val="HTML"/>
+          <w:rFonts w:ascii="Times New Roman" w:hAnsi="Times New Roman" w:cs="Times New Roman"/>
+          <w:sz w:val="28"/>
+          <w:szCs w:val="28"/>
+        </w:rPr>
+        <w:t>SIGINT</w:t>
+      </w:r>
+      <w:r>
+        <w:rPr>
+          <w:sz w:val="28"/>
+          <w:szCs w:val="28"/>
+        </w:rPr>
+        <w:t xml:space="preserve"> і автоматично завершує залишкові процеси </w:t>
+      </w:r>
+      <w:proofErr w:type="spellStart"/>
+      <w:r>
+        <w:rPr>
+          <w:sz w:val="28"/>
+          <w:szCs w:val="28"/>
         </w:rPr>
         <w:t>Gazebo</w:t>
       </w:r>
       <w:proofErr w:type="spellEnd"/>
       <w:r>
         <w:rPr>
-          <w:color w:val="000000" w:themeColor="text1"/>
-          <w:sz w:val="26"/>
-          <w:szCs w:val="26"/>
-        </w:rPr>
-        <w:t xml:space="preserve">, процеси якого залишаються активними після переривання </w:t>
-      </w:r>
-      <w:proofErr w:type="spellStart"/>
-      <w:r>
-        <w:rPr>
-          <w:color w:val="000000" w:themeColor="text1"/>
-          <w:sz w:val="26"/>
-          <w:szCs w:val="26"/>
-        </w:rPr>
-        <w:t>скрипта</w:t>
-      </w:r>
-      <w:proofErr w:type="spellEnd"/>
-      <w:r>
-        <w:rPr>
-          <w:color w:val="000000" w:themeColor="text1"/>
-          <w:sz w:val="26"/>
-          <w:szCs w:val="26"/>
-        </w:rPr>
-        <w:t xml:space="preserve">. Для вирішення цієї проблеми застосовано команду </w:t>
-      </w:r>
-      <w:proofErr w:type="spellStart"/>
-      <w:r>
-        <w:rPr>
-          <w:color w:val="000000" w:themeColor="text1"/>
-          <w:sz w:val="26"/>
-          <w:szCs w:val="26"/>
-        </w:rPr>
-        <w:t>trap</w:t>
-      </w:r>
-      <w:proofErr w:type="spellEnd"/>
-      <w:r>
-        <w:rPr>
-          <w:color w:val="000000" w:themeColor="text1"/>
-          <w:sz w:val="26"/>
-          <w:szCs w:val="26"/>
-        </w:rPr>
-        <w:t>, яка перехоплює сигнал SIGINT (</w:t>
-      </w:r>
-      <w:proofErr w:type="spellStart"/>
-      <w:r>
-        <w:rPr>
-          <w:color w:val="000000" w:themeColor="text1"/>
-          <w:sz w:val="26"/>
-          <w:szCs w:val="26"/>
-        </w:rPr>
-        <w:t>Ctrl+C</w:t>
-      </w:r>
-      <w:proofErr w:type="spellEnd"/>
-      <w:r>
-        <w:rPr>
-          <w:color w:val="000000" w:themeColor="text1"/>
-          <w:sz w:val="26"/>
-          <w:szCs w:val="26"/>
-        </w:rPr>
-        <w:t xml:space="preserve">) та автоматично завершує залишкові процеси командою </w:t>
-      </w:r>
-      <w:proofErr w:type="spellStart"/>
-      <w:r>
-        <w:rPr>
-          <w:color w:val="000000" w:themeColor="text1"/>
-          <w:sz w:val="26"/>
-          <w:szCs w:val="26"/>
+          <w:sz w:val="28"/>
+          <w:szCs w:val="28"/>
+        </w:rPr>
+        <w:t xml:space="preserve"> командою </w:t>
+      </w:r>
+      <w:proofErr w:type="spellStart"/>
+      <w:r>
+        <w:rPr>
+          <w:rStyle w:val="HTML"/>
+          <w:rFonts w:ascii="Times New Roman" w:hAnsi="Times New Roman" w:cs="Times New Roman"/>
+          <w:sz w:val="28"/>
+          <w:szCs w:val="28"/>
         </w:rPr>
         <w:t>killall</w:t>
       </w:r>
       <w:proofErr w:type="spellEnd"/>
       <w:r>
         <w:rPr>
-          <w:color w:val="000000" w:themeColor="text1"/>
-          <w:sz w:val="26"/>
-          <w:szCs w:val="26"/>
+          <w:rStyle w:val="HTML"/>
+          <w:rFonts w:ascii="Times New Roman" w:hAnsi="Times New Roman" w:cs="Times New Roman"/>
+          <w:sz w:val="28"/>
+          <w:szCs w:val="28"/>
         </w:rPr>
         <w:t xml:space="preserve"> -9 </w:t>
       </w:r>
       <w:proofErr w:type="spellStart"/>
       <w:r>
         <w:rPr>
-          <w:color w:val="000000" w:themeColor="text1"/>
-          <w:sz w:val="26"/>
-          <w:szCs w:val="26"/>
+          <w:rStyle w:val="HTML"/>
+          <w:rFonts w:ascii="Times New Roman" w:hAnsi="Times New Roman" w:cs="Times New Roman"/>
+          <w:sz w:val="28"/>
+          <w:szCs w:val="28"/>
         </w:rPr>
         <w:t>gzserver</w:t>
       </w:r>
       <w:proofErr w:type="spellEnd"/>
       <w:r>
         <w:rPr>
-          <w:color w:val="000000" w:themeColor="text1"/>
-          <w:sz w:val="26"/>
-          <w:szCs w:val="26"/>
-        </w:rPr>
-        <w:t xml:space="preserve"> </w:t>
-      </w:r>
-      <w:proofErr w:type="spellStart"/>
-      <w:r>
-        <w:rPr>
-          <w:color w:val="000000" w:themeColor="text1"/>
-          <w:sz w:val="26"/>
-          <w:szCs w:val="26"/>
+          <w:rStyle w:val="HTML"/>
+          <w:rFonts w:ascii="Times New Roman" w:hAnsi="Times New Roman" w:cs="Times New Roman"/>
+          <w:sz w:val="28"/>
+          <w:szCs w:val="28"/>
+        </w:rPr>
+        <w:t xml:space="preserve"> </w:t>
+      </w:r>
+      <w:proofErr w:type="spellStart"/>
+      <w:r>
+        <w:rPr>
+          <w:rStyle w:val="HTML"/>
+          <w:rFonts w:ascii="Times New Roman" w:hAnsi="Times New Roman" w:cs="Times New Roman"/>
+          <w:sz w:val="28"/>
+          <w:szCs w:val="28"/>
         </w:rPr>
         <w:t>gzclient</w:t>
       </w:r>
       <w:proofErr w:type="spellEnd"/>
       <w:r>
         <w:rPr>
-          <w:color w:val="000000" w:themeColor="text1"/>
-          <w:sz w:val="26"/>
-          <w:szCs w:val="26"/>
-        </w:rPr>
-        <w:t>, вивільняючи мережеві порти та пам'ять.</w:t>
-      </w:r>
-    </w:p>
-    <w:p>
-      <w:pPr>
-        <w:pStyle w:val="a9"/>
-        <w:spacing w:line="360" w:lineRule="auto"/>
-        <w:ind w:right="567"/>
-        <w:rPr>
-          <w:color w:val="000000" w:themeColor="text1"/>
-          <w:sz w:val="26"/>
-          <w:szCs w:val="26"/>
-        </w:rPr>
-      </w:pPr>
+          <w:sz w:val="28"/>
+          <w:szCs w:val="28"/>
+        </w:rPr>
+        <w:t>, що дає змогу уникнути зайнятих портів і залишкових процесів після завершення симуляції.</w:t>
+      </w:r>
     </w:p>
     <w:p>
       <w:pPr>
@@ -5235,18 +5264,6 @@
     <w:p>
       <w:pPr>
         <w:pStyle w:val="a9"/>
-        <w:spacing w:line="360" w:lineRule="auto"/>
-        <w:ind w:left="1080" w:right="567"/>
-        <w:rPr>
-          <w:color w:val="000000" w:themeColor="text1"/>
-          <w:sz w:val="26"/>
-          <w:szCs w:val="26"/>
-        </w:rPr>
-      </w:pPr>
-    </w:p>
-    <w:p>
-      <w:pPr>
-        <w:pStyle w:val="a9"/>
         <w:numPr>
           <w:ilvl w:val="0"/>
           <w:numId w:val="9"/>
@@ -5482,18 +5499,6 @@
         </w:rPr>
         <w:t>.</w:t>
       </w:r>
-    </w:p>
-    <w:p>
-      <w:pPr>
-        <w:pStyle w:val="a9"/>
-        <w:spacing w:line="360" w:lineRule="auto"/>
-        <w:ind w:left="1080" w:right="567"/>
-        <w:rPr>
-          <w:color w:val="000000" w:themeColor="text1"/>
-          <w:sz w:val="26"/>
-          <w:szCs w:val="26"/>
-        </w:rPr>
-      </w:pPr>
     </w:p>
     <w:p>
       <w:pPr>
@@ -8723,6 +8728,7 @@
       </w:pPr>
       <w:r>
         <w:rPr>
+          <w:noProof/>
           <w:color w:val="000000" w:themeColor="text1"/>
           <w:sz w:val="26"/>
           <w:szCs w:val="26"/>
@@ -9795,23 +9801,7 @@
                               <w:sz w:val="28"/>
                               <w:szCs w:val="28"/>
                             </w:rPr>
-                            <m:t>-6,7</m:t>
-                          </m:r>
-                          <m:r>
-                            <w:rPr>
-                              <w:rFonts w:ascii="Cambria Math" w:hAnsi="Cambria Math"/>
-                              <w:sz w:val="28"/>
-                              <w:szCs w:val="28"/>
-                            </w:rPr>
-                            <m:t>72</m:t>
-                          </m:r>
-                          <m:r>
-                            <w:rPr>
-                              <w:rFonts w:ascii="Cambria Math" w:hAnsi="Cambria Math"/>
-                              <w:sz w:val="28"/>
-                              <w:szCs w:val="28"/>
-                            </w:rPr>
-                            <m:t>-</m:t>
+                            <m:t>-6,772-</m:t>
                           </m:r>
                           <m:d>
                             <m:dPr>
@@ -9887,23 +9877,7 @@
                               <w:sz w:val="28"/>
                               <w:szCs w:val="28"/>
                             </w:rPr>
-                            <m:t>-1,3</m:t>
-                          </m:r>
-                          <m:r>
-                            <w:rPr>
-                              <w:rFonts w:ascii="Cambria Math" w:hAnsi="Cambria Math"/>
-                              <w:sz w:val="28"/>
-                              <w:szCs w:val="28"/>
-                            </w:rPr>
-                            <m:t>58</m:t>
-                          </m:r>
-                          <m:r>
-                            <w:rPr>
-                              <w:rFonts w:ascii="Cambria Math" w:hAnsi="Cambria Math"/>
-                              <w:sz w:val="28"/>
-                              <w:szCs w:val="28"/>
-                            </w:rPr>
-                            <m:t>-</m:t>
+                            <m:t>-1,358-</m:t>
                           </m:r>
                           <m:d>
                             <m:dPr>
@@ -9978,16 +9952,7 @@
               <w:szCs w:val="28"/>
               <w:lang w:val="en-US"/>
             </w:rPr>
-            <m:t>e=0,2</m:t>
-          </m:r>
-          <m:r>
-            <w:rPr>
-              <w:rFonts w:ascii="Cambria Math" w:hAnsi="Cambria Math"/>
-              <w:sz w:val="28"/>
-              <w:szCs w:val="28"/>
-              <w:lang w:val="en-US"/>
-            </w:rPr>
-            <m:t>2</m:t>
+            <m:t>e=0,22</m:t>
           </m:r>
           <m:r>
             <w:rPr>
@@ -23781,29 +23746,7 @@
           <w:szCs w:val="18"/>
           <w:lang w:eastAsia="uk-UA"/>
         </w:rPr>
-        <w:t xml:space="preserve"> </w:t>
-      </w:r>
-      <w:proofErr w:type="spellStart"/>
-      <w:r>
-        <w:rPr>
-          <w:rFonts w:ascii="Consolas" w:hAnsi="Consolas"/>
-          <w:color w:val="A31515"/>
-          <w:sz w:val="18"/>
-          <w:szCs w:val="18"/>
-          <w:lang w:eastAsia="uk-UA"/>
-        </w:rPr>
-        <w:t>takeoff</w:t>
-      </w:r>
-      <w:proofErr w:type="spellEnd"/>
-      <w:r>
-        <w:rPr>
-          <w:rFonts w:ascii="Consolas" w:hAnsi="Consolas"/>
-          <w:color w:val="A31515"/>
-          <w:sz w:val="18"/>
-          <w:szCs w:val="18"/>
-          <w:lang w:eastAsia="uk-UA"/>
-        </w:rPr>
-        <w:t xml:space="preserve"> </w:t>
+        <w:t xml:space="preserve"> takeoff </w:t>
       </w:r>
       <w:proofErr w:type="spellStart"/>
       <w:r>
@@ -24609,29 +24552,7 @@
           <w:szCs w:val="18"/>
           <w:lang w:eastAsia="uk-UA"/>
         </w:rPr>
-        <w:t xml:space="preserve"> </w:t>
-      </w:r>
-      <w:proofErr w:type="spellStart"/>
-      <w:r>
-        <w:rPr>
-          <w:rFonts w:ascii="Consolas" w:hAnsi="Consolas"/>
-          <w:color w:val="A31515"/>
-          <w:sz w:val="18"/>
-          <w:szCs w:val="18"/>
-          <w:lang w:eastAsia="uk-UA"/>
-        </w:rPr>
-        <w:t>altitude</w:t>
-      </w:r>
-      <w:proofErr w:type="spellEnd"/>
-      <w:r>
-        <w:rPr>
-          <w:rFonts w:ascii="Consolas" w:hAnsi="Consolas"/>
-          <w:color w:val="A31515"/>
-          <w:sz w:val="18"/>
-          <w:szCs w:val="18"/>
-          <w:lang w:eastAsia="uk-UA"/>
-        </w:rPr>
-        <w:t xml:space="preserve"> </w:t>
+        <w:t xml:space="preserve"> altitude </w:t>
       </w:r>
       <w:proofErr w:type="spellStart"/>
       <w:r>
@@ -24831,29 +24752,7 @@
           <w:szCs w:val="18"/>
           <w:lang w:eastAsia="uk-UA"/>
         </w:rPr>
-        <w:t xml:space="preserve"> </w:t>
-      </w:r>
-      <w:proofErr w:type="spellStart"/>
-      <w:r>
-        <w:rPr>
-          <w:rFonts w:ascii="Consolas" w:hAnsi="Consolas"/>
-          <w:color w:val="A31515"/>
-          <w:sz w:val="18"/>
-          <w:szCs w:val="18"/>
-          <w:lang w:eastAsia="uk-UA"/>
-        </w:rPr>
-        <w:t>at</w:t>
-      </w:r>
-      <w:proofErr w:type="spellEnd"/>
-      <w:r>
-        <w:rPr>
-          <w:rFonts w:ascii="Consolas" w:hAnsi="Consolas"/>
-          <w:color w:val="A31515"/>
-          <w:sz w:val="18"/>
-          <w:szCs w:val="18"/>
-          <w:lang w:eastAsia="uk-UA"/>
-        </w:rPr>
-        <w:t xml:space="preserve"> </w:t>
+        <w:t xml:space="preserve"> at </w:t>
       </w:r>
       <w:proofErr w:type="spellStart"/>
       <w:r>
@@ -28652,29 +28551,7 @@
           <w:szCs w:val="18"/>
           <w:lang w:eastAsia="uk-UA"/>
         </w:rPr>
-        <w:t xml:space="preserve"> </w:t>
-      </w:r>
-      <w:proofErr w:type="spellStart"/>
-      <w:r>
-        <w:rPr>
-          <w:rFonts w:ascii="Consolas" w:hAnsi="Consolas"/>
-          <w:color w:val="A31515"/>
-          <w:sz w:val="18"/>
-          <w:szCs w:val="18"/>
-          <w:lang w:eastAsia="uk-UA"/>
-        </w:rPr>
-        <w:t>flight</w:t>
-      </w:r>
-      <w:proofErr w:type="spellEnd"/>
-      <w:r>
-        <w:rPr>
-          <w:rFonts w:ascii="Consolas" w:hAnsi="Consolas"/>
-          <w:color w:val="A31515"/>
-          <w:sz w:val="18"/>
-          <w:szCs w:val="18"/>
-          <w:lang w:eastAsia="uk-UA"/>
-        </w:rPr>
-        <w:t xml:space="preserve"> </w:t>
+        <w:t xml:space="preserve"> flight </w:t>
       </w:r>
       <w:proofErr w:type="spellStart"/>
       <w:r>
@@ -40715,29 +40592,7 @@
           <w:szCs w:val="18"/>
           <w:lang w:eastAsia="uk-UA"/>
         </w:rPr>
-        <w:t xml:space="preserve"> </w:t>
-      </w:r>
-      <w:proofErr w:type="spellStart"/>
-      <w:r>
-        <w:rPr>
-          <w:rFonts w:ascii="Consolas" w:hAnsi="Consolas"/>
-          <w:color w:val="A31515"/>
-          <w:sz w:val="18"/>
-          <w:szCs w:val="18"/>
-          <w:lang w:eastAsia="uk-UA"/>
-        </w:rPr>
-        <w:t>request</w:t>
-      </w:r>
-      <w:proofErr w:type="spellEnd"/>
-      <w:r>
-        <w:rPr>
-          <w:rFonts w:ascii="Consolas" w:hAnsi="Consolas"/>
-          <w:color w:val="A31515"/>
-          <w:sz w:val="18"/>
-          <w:szCs w:val="18"/>
-          <w:lang w:eastAsia="uk-UA"/>
-        </w:rPr>
-        <w:t xml:space="preserve"> </w:t>
+        <w:t xml:space="preserve"> request </w:t>
       </w:r>
       <w:proofErr w:type="spellStart"/>
       <w:r>

</xml_diff>